<commit_message>
fix(autobericht): harden report and media workflows
Keep all steering controls and status text in simple English while report language still selects content, spellcheck, templates, and exports. Copy videos into photos/videos without mutating photos/raw. Make browser startup fail visibly when core modules are missing, and share Markdown/report-row rules across preview, Word, and PowerPoint exports.

Isomorphism Card:
- Lever: replace duplicated fallbacks and renderer-specific parsing with required shared modules.
- Invariants: project/report data, report locale selection, and Office template contracts stay unchanged.
- Evidence: 29 automated tests pass, including strict DOCX validation and rendered French PPTX export.
- Production JS delta: 647 additions, 861 deletions (net -214).
</commit_message>
<xml_diff>
--- a/docs/onboarding/AutoBericht-Guida-Rapida-IT.docx
+++ b/docs/onboarding/AutoBericht-Guida-Rapida-IT.docx
@@ -290,10 +290,10 @@
           <w:b/>
           <w:bCs/>
         </w:rPr>
-        <w:t xml:space="preserve">Locale</w:t>
-      </w:r>
-      <w:r>
-        <w:t xml:space="preserve">, scegli la lingua (</w:t>
+        <w:t xml:space="preserve">Language</w:t>
+      </w:r>
+      <w:r>
+        <w:t xml:space="preserve">, scegli la lingua del report (</w:t>
       </w:r>
       <w:r>
         <w:rPr>
@@ -346,7 +346,7 @@
         <w:pStyle w:val="FirstParagraph"/>
       </w:pPr>
       <w:r>
-        <w:t xml:space="preserve">Cerchi rossi: Locale, Import Self-Assessment, Word/PPT Export.</w:t>
+        <w:t xml:space="preserve">Cerchi rossi: Language, Import Self-Assessment, Word/PPT Export.</w:t>
       </w:r>
     </w:p>
     <w:p>
@@ -423,7 +423,7 @@
         </w:numPr>
       </w:pPr>
       <w:r>
-        <w:t xml:space="preserve">Metti le foto originali in</w:t>
+        <w:t xml:space="preserve">Metti le foto e i video originali in</w:t>
       </w:r>
       <w:r>
         <w:t xml:space="preserve"> </w:t>
@@ -613,7 +613,7 @@
         <w:t xml:space="preserve">Import photos</w:t>
       </w:r>
       <w:r>
-        <w:t xml:space="preserve">: import + resize in</w:t>
+        <w:t xml:space="preserve">: le copie delle immagini vengono ridimensionate in</w:t>
       </w:r>
       <w:r>
         <w:t xml:space="preserve"> </w:t>
@@ -628,7 +628,34 @@
         <w:t xml:space="preserve"> </w:t>
       </w:r>
       <w:r>
-        <w:t xml:space="preserve">(lato lungo max. 1920 px).</w:t>
+        <w:t xml:space="preserve">(lato lungo max. 1920 px); i video vengono copiati in</w:t>
+      </w:r>
+      <w:r>
+        <w:t xml:space="preserve"> </w:t>
+      </w:r>
+      <w:r>
+        <w:rPr>
+          <w:rStyle w:val="VerbatimChar"/>
+        </w:rPr>
+        <w:t xml:space="preserve">photos/videos</w:t>
+      </w:r>
+      <w:r>
+        <w:t xml:space="preserve">. Gli originali in</w:t>
+      </w:r>
+      <w:r>
+        <w:t xml:space="preserve"> </w:t>
+      </w:r>
+      <w:r>
+        <w:rPr>
+          <w:rStyle w:val="VerbatimChar"/>
+        </w:rPr>
+        <w:t xml:space="preserve">photos/raw</w:t>
+      </w:r>
+      <w:r>
+        <w:t xml:space="preserve"> </w:t>
+      </w:r>
+      <w:r>
+        <w:t xml:space="preserve">restano intatti.</w:t>
       </w:r>
     </w:p>
     <w:p>
@@ -1518,7 +1545,11 @@
     </w:p>
     <w:bookmarkEnd w:id="54"/>
     <w:bookmarkEnd w:id="55"/>
-    <w:sectPr/>
+    <w:sectPr>
+      <w:footnotePr>
+        <w:numRestart w:val="eachSect"/>
+      </w:footnotePr>
+    </w:sectPr>
   </w:body>
 </w:document>
 </file>

</xml_diff>